<commit_message>
Add REDCap project to Parexel resume
</commit_message>
<xml_diff>
--- a/output/cv-alanis-sun-parexel-clinical-trial-associate-senior-project-specialist-r0000046154-2026-09-25.docx
+++ b/output/cv-alanis-sun-parexel-clinical-trial-associate-senior-project-specialist-r0000046154-2026-09-25.docx
@@ -1,6 +1,6 @@
 
 <file path=word/document.xml><?xml version="1.0" encoding="utf-8"?>
-<w:document xmlns:w="http://schemas.openxmlformats.org/wordprocessingml/2006/main">
+<w:document xmlns:r="http://schemas.openxmlformats.org/officeDocument/2006/relationships" xmlns:w="http://schemas.openxmlformats.org/wordprocessingml/2006/main">
   <w:body>
     <w:p>
       <w:pPr>
@@ -69,15 +69,15 @@
         <w:t>Akesoe Biologics</w:t>
       </w:r>
       <w:r>
-        <w:t xml:space="preserve"> | Winter Springs, FL | May 2026–Present</w:t>
-      </w:r>
-    </w:p>
-    <w:p>
-      <w:pPr>
-        <w:pStyle w:val="ListBullet"/>
-      </w:pPr>
-      <w:r>
-        <w:t>Developed a phased plan for an approximately 7–9 phase early-stage stem-cell project by breaking early phases into detailed tasks, assigning responsibilities, identifying dependencies, and tracking progress in ClickUp.</w:t>
+        <w:t xml:space="preserve"> | Winter Springs, FL | May 2026-Present</w:t>
+      </w:r>
+    </w:p>
+    <w:p>
+      <w:pPr>
+        <w:pStyle w:val="ListBullet"/>
+      </w:pPr>
+      <w:r>
+        <w:t>Developed a phased plan for an approximately 7-9 phase early-stage stem-cell project by breaking early phases into detailed tasks, assigning responsibilities, identifying dependencies, and tracking progress in ClickUp.</w:t>
       </w:r>
     </w:p>
     <w:p>
@@ -131,7 +131,7 @@
         <w:t>Vaxxinity</w:t>
       </w:r>
       <w:r>
-        <w:t xml:space="preserve"> | Merritt Island, FL | Oct 2018–Jan 2025</w:t>
+        <w:t xml:space="preserve"> | Merritt Island, FL | Oct 2018-Jan 2025</w:t>
       </w:r>
     </w:p>
     <w:p>
@@ -179,6 +179,39 @@
         <w:pStyle w:val="Heading1"/>
       </w:pPr>
       <w:r>
+        <w:t>Independent Project</w:t>
+      </w:r>
+    </w:p>
+    <w:p>
+      <w:pPr>
+        <w:pStyle w:val="Heading2"/>
+      </w:pPr>
+      <w:r>
+        <w:t xml:space="preserve">Phase I Clinical Trial REDCap/EDC Simulation - SIM-001 | </w:t>
+      </w:r>
+      <w:hyperlink r:id="rId3">
+        <w:r>
+          <w:rPr>
+            <w:color w:val="0563C1"/>
+            <w:u w:val="single"/>
+          </w:rPr>
+          <w:t>Portfolio</w:t>
+        </w:r>
+      </w:hyperlink>
+    </w:p>
+    <w:p>
+      <w:pPr>
+        <w:pStyle w:val="Normal"/>
+      </w:pPr>
+      <w:r>
+        <w:t>Designed Phase I longitudinal CRFs, visit/event mapping, clinical-sample traceability, and data-quality controls in REDCap.</w:t>
+      </w:r>
+    </w:p>
+    <w:p>
+      <w:pPr>
+        <w:pStyle w:val="Heading1"/>
+      </w:pPr>
+      <w:r>
         <w:t>Education</w:t>
       </w:r>
     </w:p>
@@ -193,7 +226,7 @@
         <w:t>M.S., Biomedical Science, Physiology &amp; Pharmacology</w:t>
       </w:r>
       <w:r>
-        <w:t xml:space="preserve"> — Chang Gung University | 2017–2018</w:t>
+        <w:t xml:space="preserve"> - Chang Gung University | 2017-2018</w:t>
       </w:r>
     </w:p>
     <w:p>
@@ -215,7 +248,7 @@
         <w:t>B.S., Biomedical Science</w:t>
       </w:r>
       <w:r>
-        <w:t xml:space="preserve"> — Chang Gung University | 2013–2017</w:t>
+        <w:t xml:space="preserve"> - Chang Gung University | 2013-2017</w:t>
       </w:r>
     </w:p>
     <w:p>
@@ -231,15 +264,15 @@
         <w:pStyle w:val="ListBullet"/>
       </w:pPr>
       <w:r>
-        <w:t>Google Project Management Certificate — Google, 2025</w:t>
-      </w:r>
-    </w:p>
-    <w:p>
-      <w:pPr>
-        <w:pStyle w:val="ListBullet"/>
-      </w:pPr>
-      <w:r>
-        <w:t>Data Management for Clinical Research — Vanderbilt University, 2025</w:t>
+        <w:t>Google Project Management Certificate - Google, 2025</w:t>
+      </w:r>
+    </w:p>
+    <w:p>
+      <w:pPr>
+        <w:pStyle w:val="ListBullet"/>
+      </w:pPr>
+      <w:r>
+        <w:t>Data Management for Clinical Research - Vanderbilt University, 2025</w:t>
       </w:r>
     </w:p>
     <w:p>

</xml_diff>

<commit_message>
Update Parexel 032 independent projects
</commit_message>
<xml_diff>
--- a/output/cv-alanis-sun-parexel-clinical-trial-associate-senior-project-specialist-r0000046154-2026-09-25.docx
+++ b/output/cv-alanis-sun-parexel-clinical-trial-associate-senior-project-specialist-r0000046154-2026-09-25.docx
@@ -4,190 +4,10 @@
   <w:body>
     <w:p>
       <w:pPr>
-        <w:pStyle w:val="Title"/>
-      </w:pPr>
-      <w:r>
-        <w:t>Alanis Sun</w:t>
-      </w:r>
-    </w:p>
-    <w:p>
-      <w:pPr>
-        <w:pStyle w:val="Normal"/>
-      </w:pPr>
-      <w:r>
-        <w:t>Cocoa, FL | 321-750-7281 | yushuangsun36@gmail.com</w:t>
-      </w:r>
-    </w:p>
-    <w:p>
-      <w:pPr>
-        <w:pStyle w:val="Normal"/>
-      </w:pPr>
-      <w:r>
-        <w:t>US Permanent Resident | Bilingual: English and Mandarin Chinese</w:t>
-      </w:r>
-    </w:p>
-    <w:p>
-      <w:pPr>
-        <w:pStyle w:val="Heading1"/>
-      </w:pPr>
-      <w:r>
-        <w:t>Professional Summary</w:t>
-      </w:r>
-    </w:p>
-    <w:p>
-      <w:pPr>
-        <w:pStyle w:val="Normal"/>
-      </w:pPr>
-      <w:r>
-        <w:t>Clinical research professional with 6+ years supporting Phase I/II clinical-development programs in a GLP biotech environment, with experience in clinical sample, data, and supporting-document workflows, CRO and internal clinical-team coordination, discrepancy investigation, and regulated documentation. Additional experience includes phased project planning, dependency tracking, and weekly status reporting.</w:t>
-      </w:r>
-    </w:p>
-    <w:p>
-      <w:pPr>
-        <w:pStyle w:val="Heading1"/>
-      </w:pPr>
-      <w:r>
-        <w:t>Professional Experience</w:t>
-      </w:r>
-    </w:p>
-    <w:p>
-      <w:pPr>
-        <w:pStyle w:val="Heading2"/>
-      </w:pPr>
-      <w:r>
-        <w:t>Manager, Lab Operations</w:t>
-      </w:r>
-    </w:p>
-    <w:p>
-      <w:pPr>
-        <w:pStyle w:val="Normal"/>
-      </w:pPr>
-      <w:r>
-        <w:rPr>
-          <w:b/>
-        </w:rPr>
-        <w:t>Akesoe Biologics</w:t>
-      </w:r>
-      <w:r>
-        <w:t xml:space="preserve"> | Winter Springs, FL | May 2026-Present</w:t>
-      </w:r>
-    </w:p>
-    <w:p>
-      <w:pPr>
-        <w:pStyle w:val="ListBullet"/>
-      </w:pPr>
-      <w:r>
-        <w:t>Developed a phased plan for an approximately 7-9 phase early-stage stem-cell project by breaking early phases into detailed tasks, assigning responsibilities, identifying dependencies, and tracking progress in ClickUp.</w:t>
-      </w:r>
-    </w:p>
-    <w:p>
-      <w:pPr>
-        <w:pStyle w:val="ListBullet"/>
-      </w:pPr>
-      <w:r>
-        <w:t>Prepared weekly project-status reports summarizing completed work, potential impacts, next steps, and pending follow-ups; coordinated cross-functional inputs, resource needs, and issue follow-up.</w:t>
-      </w:r>
-    </w:p>
-    <w:p>
-      <w:pPr>
-        <w:pStyle w:val="ListBullet"/>
-      </w:pPr>
-      <w:r>
-        <w:t>Reviewed 30+ SOP/DCR records and electronic documents, identified documentation and version inconsistencies, and supported documentation and form-completion improvements.</w:t>
-      </w:r>
-    </w:p>
-    <w:p>
-      <w:pPr>
-        <w:pStyle w:val="ListBullet"/>
-      </w:pPr>
-      <w:r>
-        <w:t>Identified a compliance/resource-allocation risk related to a proposed GMP certification approach, researched the issue, and recommended a gap-based assessment that led to an internal mock-audit exercise.</w:t>
-      </w:r>
-    </w:p>
-    <w:p>
-      <w:pPr>
-        <w:pStyle w:val="ListBullet"/>
-      </w:pPr>
-      <w:r>
-        <w:t>Supported vendor/equipment evaluation through requirements definition, vendor discussions, quotation review, and comparison of options for decision support.</w:t>
-      </w:r>
-    </w:p>
-    <w:p>
-      <w:pPr>
-        <w:pStyle w:val="Heading2"/>
-      </w:pPr>
-      <w:r>
-        <w:t>Research Associate I</w:t>
-      </w:r>
-    </w:p>
-    <w:p>
-      <w:pPr>
-        <w:pStyle w:val="Normal"/>
-      </w:pPr>
-      <w:r>
-        <w:rPr>
-          <w:b/>
-        </w:rPr>
-        <w:t>Vaxxinity</w:t>
-      </w:r>
-      <w:r>
-        <w:t xml:space="preserve"> | Merritt Island, FL | Oct 2018-Jan 2025</w:t>
-      </w:r>
-    </w:p>
-    <w:p>
-      <w:pPr>
-        <w:pStyle w:val="ListBullet"/>
-      </w:pPr>
-      <w:r>
-        <w:t>Supported Phase I/II clinical-development programs in a GLP environment through clinical bioanalytical ELISA testing, assay validation, QC, troubleshooting, data analysis, and communication of results and supporting documentation to CRO data teams.</w:t>
-      </w:r>
-    </w:p>
-    <w:p>
-      <w:pPr>
-        <w:pStyle w:val="ListBullet"/>
-      </w:pPr>
-      <w:r>
-        <w:t>Worked with 4,000+ clinical samples in a Phase I sample-management workflow through receipt/source-document verification, CRO/internal ID traceability, Benchling records, exception investigation, and coordination with sample-management personnel on retrieval and return.</w:t>
-      </w:r>
-    </w:p>
-    <w:p>
-      <w:pPr>
-        <w:pStyle w:val="ListBullet"/>
-      </w:pPr>
-      <w:r>
-        <w:t>Investigated a CRO calculation/data discrepancy by reviewing underlying assay data and supporting documentation, clarifying methodology, confirming visit-timing interpretation with the internal clinical team, and reviewing corrected CRO output.</w:t>
-      </w:r>
-    </w:p>
-    <w:p>
-      <w:pPr>
-        <w:pStyle w:val="ListBullet"/>
-      </w:pPr>
-      <w:r>
-        <w:t>Coordinated assigned technical and data issues with CRO data teams, internal clinical teams, sample-management personnel, and supervisors to support documentation accuracy and issue resolution.</w:t>
-      </w:r>
-    </w:p>
-    <w:p>
-      <w:pPr>
-        <w:pStyle w:val="ListBullet"/>
-      </w:pPr>
-      <w:r>
-        <w:t>Analyzed assay and titer data using Excel and GraphPad Prism, including cut-point analysis, titer determination, precision assessment, and %CV calculations.</w:t>
-      </w:r>
-    </w:p>
-    <w:p>
-      <w:pPr>
-        <w:pStyle w:val="Heading1"/>
-      </w:pPr>
-      <w:r>
-        <w:t>Independent Project</w:t>
-      </w:r>
-    </w:p>
-    <w:p>
-      <w:pPr>
-        <w:pStyle w:val="Heading2"/>
-      </w:pPr>
-      <w:r>
-        <w:t xml:space="preserve">Phase I Clinical Trial REDCap/EDC Simulation - SIM-001 | </w:t>
+        <w:pStyle w:val="Heading1"/>
+      </w:pPr>
+      <w:r>
+        <w:t xml:space="preserve">INDEPENDENT PROJECTS | </w:t>
       </w:r>
       <w:hyperlink r:id="rId3">
         <w:r>
@@ -195,7 +15,7 @@
             <w:color w:val="0563C1"/>
             <w:u w:val="single"/>
           </w:rPr>
-          <w:t>Portfolio</w:t>
+          <w:t>GitHub Portfolio</w:t>
         </w:r>
       </w:hyperlink>
     </w:p>
@@ -203,6 +23,26 @@
       <w:pPr>
         <w:pStyle w:val="Normal"/>
       </w:pPr>
+      <w:r>
+        <w:rPr>
+          <w:b/>
+        </w:rPr>
+        <w:t>Clinical Study Operations Simulation: </w:t>
+      </w:r>
+      <w:r>
+        <w:t>Integrated Phase I timeline, milestones, dependencies, baseline/forecast variance, delivery health, cross-functional RACI, and governance/escalation workflows.</w:t>
+      </w:r>
+    </w:p>
+    <w:p>
+      <w:pPr>
+        <w:pStyle w:val="Normal"/>
+      </w:pPr>
+      <w:r>
+        <w:rPr>
+          <w:b/>
+        </w:rPr>
+        <w:t>Phase I Clinical Trial REDCap/EDC Simulation — SIM-001: </w:t>
+      </w:r>
       <w:r>
         <w:t>Designed Phase I longitudinal CRFs, visit/event mapping, clinical-sample traceability, and data-quality controls in REDCap.</w:t>
       </w:r>

</xml_diff>

<commit_message>
Finalize Parexel 032 resume wording
</commit_message>
<xml_diff>
--- a/output/cv-alanis-sun-parexel-clinical-trial-associate-senior-project-specialist-r0000046154-2026-09-25.docx
+++ b/output/cv-alanis-sun-parexel-clinical-trial-associate-senior-project-specialist-r0000046154-2026-09-25.docx
@@ -2,6 +2,178 @@
 <file path=word/document.xml><?xml version="1.0" encoding="utf-8"?>
 <w:document xmlns:r="http://schemas.openxmlformats.org/officeDocument/2006/relationships" xmlns:w="http://schemas.openxmlformats.org/wordprocessingml/2006/main">
   <w:body>
+    <w:p>
+      <w:pPr>
+        <w:pStyle w:val="Title"/>
+      </w:pPr>
+      <w:r>
+        <w:t>Alanis Sun</w:t>
+      </w:r>
+    </w:p>
+    <w:p>
+      <w:pPr>
+        <w:pStyle w:val="Normal"/>
+      </w:pPr>
+      <w:r>
+        <w:t>Cocoa, FL | 321-750-7281 | yushuangsun36@gmail.com</w:t>
+      </w:r>
+    </w:p>
+    <w:p>
+      <w:pPr>
+        <w:pStyle w:val="Normal"/>
+      </w:pPr>
+      <w:r>
+        <w:t>US Permanent Resident | Bilingual: English and Mandarin Chinese</w:t>
+      </w:r>
+    </w:p>
+    <w:p>
+      <w:pPr>
+        <w:pStyle w:val="Heading1"/>
+      </w:pPr>
+      <w:r>
+        <w:t>Professional Summary</w:t>
+      </w:r>
+    </w:p>
+    <w:p>
+      <w:pPr>
+        <w:pStyle w:val="Normal"/>
+      </w:pPr>
+      <w:r>
+        <w:t>Clinical research professional with 6+ years supporting Phase I/II clinical-development programs in a GLP biotech environment, with experience in clinical sample, data, and supporting-document workflows, CRO and internal clinical-team coordination, discrepancy investigation, and regulated documentation. Additional experience includes phased project planning, dependency tracking, and weekly status reporting.</w:t>
+      </w:r>
+    </w:p>
+    <w:p>
+      <w:pPr>
+        <w:pStyle w:val="Heading1"/>
+      </w:pPr>
+      <w:r>
+        <w:t>Professional Experience</w:t>
+      </w:r>
+    </w:p>
+    <w:p>
+      <w:pPr>
+        <w:pStyle w:val="Heading2"/>
+      </w:pPr>
+      <w:r>
+        <w:t>Manager, Lab Operations</w:t>
+      </w:r>
+    </w:p>
+    <w:p>
+      <w:pPr>
+        <w:pStyle w:val="Normal"/>
+      </w:pPr>
+      <w:r>
+        <w:rPr>
+          <w:b/>
+        </w:rPr>
+        <w:t>Akesoe Biologics</w:t>
+      </w:r>
+      <w:r>
+        <w:t xml:space="preserve"> | Winter Springs, FL | May 2026-Present</w:t>
+      </w:r>
+    </w:p>
+    <w:p>
+      <w:pPr>
+        <w:pStyle w:val="ListBullet"/>
+      </w:pPr>
+      <w:r>
+        <w:t>Developed a phased plan for an early-stage stem-cell project by breaking early phases into detailed tasks, assigning responsibilities, identifying dependencies, and tracking progress in ClickUp.</w:t>
+      </w:r>
+    </w:p>
+    <w:p>
+      <w:pPr>
+        <w:pStyle w:val="ListBullet"/>
+      </w:pPr>
+      <w:r>
+        <w:t>Prepared weekly project-status reports summarizing completed work, potential impacts, next steps, and pending follow-ups; coordinated cross-functional inputs, resource needs, and issue follow-up.</w:t>
+      </w:r>
+    </w:p>
+    <w:p>
+      <w:pPr>
+        <w:pStyle w:val="ListBullet"/>
+      </w:pPr>
+      <w:r>
+        <w:t>Reviewed 30+ SOP/DCR records and electronic documents, identified documentation and version inconsistencies, and supported documentation and form-completion improvements.</w:t>
+      </w:r>
+    </w:p>
+    <w:p>
+      <w:pPr>
+        <w:pStyle w:val="ListBullet"/>
+      </w:pPr>
+      <w:r>
+        <w:t>Identified a compliance/resource-allocation risk related to a proposed GMP certification approach, researched the issue, and recommended a gap-based assessment that led to an internal mock-audit exercise.</w:t>
+      </w:r>
+    </w:p>
+    <w:p>
+      <w:pPr>
+        <w:pStyle w:val="ListBullet"/>
+      </w:pPr>
+      <w:r>
+        <w:t>Supported vendor/equipment evaluation through requirements definition, vendor discussions, quotation review, and comparison of options for decision support.</w:t>
+      </w:r>
+    </w:p>
+    <w:p>
+      <w:pPr>
+        <w:pStyle w:val="Heading2"/>
+      </w:pPr>
+      <w:r>
+        <w:t>Research Associate I</w:t>
+      </w:r>
+    </w:p>
+    <w:p>
+      <w:pPr>
+        <w:pStyle w:val="Normal"/>
+      </w:pPr>
+      <w:r>
+        <w:rPr>
+          <w:b/>
+        </w:rPr>
+        <w:t>Vaxxinity</w:t>
+      </w:r>
+      <w:r>
+        <w:t xml:space="preserve"> | Merritt Island, FL | Oct 2018-Jan 2025</w:t>
+      </w:r>
+    </w:p>
+    <w:p>
+      <w:pPr>
+        <w:pStyle w:val="ListBullet"/>
+      </w:pPr>
+      <w:r>
+        <w:t>Supported Phase I/II clinical-development programs in a GLP environment through clinical bioanalytical ELISA testing, assay validation, QC, troubleshooting, data analysis, and communication of results and supporting documentation to CRO data teams.</w:t>
+      </w:r>
+    </w:p>
+    <w:p>
+      <w:pPr>
+        <w:pStyle w:val="ListBullet"/>
+      </w:pPr>
+      <w:r>
+        <w:t>Worked with 4,000+ clinical samples in a Phase I sample-management workflow through receipt/source-document verification, CRO/internal ID traceability, Benchling records, exception investigation, and coordination with sample-management personnel on retrieval and return.</w:t>
+      </w:r>
+    </w:p>
+    <w:p>
+      <w:pPr>
+        <w:pStyle w:val="ListBullet"/>
+      </w:pPr>
+      <w:r>
+        <w:t>Investigated a CRO calculation/data discrepancy by reviewing underlying assay data and supporting documentation, clarifying methodology, confirming visit-timing interpretation with the internal clinical team, and reviewing corrected CRO output.</w:t>
+      </w:r>
+    </w:p>
+    <w:p>
+      <w:pPr>
+        <w:pStyle w:val="ListBullet"/>
+      </w:pPr>
+      <w:r>
+        <w:t>Coordinated assigned technical and data issues with CRO data teams, internal clinical teams, sample-management personnel, and supervisors to support documentation accuracy and issue resolution.</w:t>
+      </w:r>
+    </w:p>
+    <w:p>
+      <w:pPr>
+        <w:pStyle w:val="ListBullet"/>
+      </w:pPr>
+      <w:r>
+        <w:t>Analyzed assay and titer data using Excel and GraphPad Prism, including cut-point analysis, titer determination, precision assessment, and %CV calculations.</w:t>
+      </w:r>
+    </w:p>
     <w:p>
       <w:pPr>
         <w:pStyle w:val="Heading1"/>
@@ -27,21 +199,21 @@
         <w:rPr>
           <w:b/>
         </w:rPr>
-        <w:t>Clinical Study Operations Simulation: </w:t>
-      </w:r>
-      <w:r>
-        <w:t>Integrated Phase I timeline, milestones, dependencies, baseline/forecast variance, delivery health, cross-functional RACI, and governance/escalation workflows.</w:t>
-      </w:r>
-    </w:p>
-    <w:p>
-      <w:pPr>
-        <w:pStyle w:val="Normal"/>
-      </w:pPr>
-      <w:r>
-        <w:rPr>
-          <w:b/>
-        </w:rPr>
-        <w:t>Phase I Clinical Trial REDCap/EDC Simulation — SIM-001: </w:t>
+        <w:t xml:space="preserve">Clinical Study Operations Simulation: </w:t>
+      </w:r>
+      <w:r>
+        <w:t>Developed an integrated Phase I study timeline and milestone tracker covering dependencies, baseline/forecast variance, delivery health, cross-functional RACI, and governance/escalation workflows.</w:t>
+      </w:r>
+    </w:p>
+    <w:p>
+      <w:pPr>
+        <w:pStyle w:val="Normal"/>
+      </w:pPr>
+      <w:r>
+        <w:rPr>
+          <w:b/>
+        </w:rPr>
+        <w:t xml:space="preserve">Phase I Clinical Trial REDCap/EDC Simulation — SIM-001: </w:t>
       </w:r>
       <w:r>
         <w:t>Designed Phase I longitudinal CRFs, visit/event mapping, clinical-sample traceability, and data-quality controls in REDCap.</w:t>

</xml_diff>